<commit_message>
a little new cool C# features
</commit_message>
<xml_diff>
--- a/1 - C#.docx
+++ b/1 - C#.docx
@@ -1,6 +1,6 @@
 
 <file path=word/document.xml><?xml version="1.0" encoding="utf-8"?>
-<w:document xmlns:wpc="http://schemas.microsoft.com/office/word/2010/wordprocessingCanvas" xmlns:cx="http://schemas.microsoft.com/office/drawing/2014/chartex" xmlns:cx1="http://schemas.microsoft.com/office/drawing/2015/9/8/chartex" xmlns:cx2="http://schemas.microsoft.com/office/drawing/2015/10/21/chartex" xmlns:cx3="http://schemas.microsoft.com/office/drawing/2016/5/9/chartex" xmlns:cx4="http://schemas.microsoft.com/office/drawing/2016/5/10/chartex" xmlns:cx5="http://schemas.microsoft.com/office/drawing/2016/5/11/chartex" xmlns:cx6="http://schemas.microsoft.com/office/drawing/2016/5/12/chartex" xmlns:cx7="http://schemas.microsoft.com/office/drawing/2016/5/13/chartex" xmlns:cx8="http://schemas.microsoft.com/office/drawing/2016/5/14/chartex" xmlns:mc="http://schemas.openxmlformats.org/markup-compatibility/2006" xmlns:aink="http://schemas.microsoft.com/office/drawing/2016/ink" xmlns:am3d="http://schemas.microsoft.com/office/drawing/2017/model3d" xmlns:o="urn:schemas-microsoft-com:office:office" xmlns:oel="http://schemas.microsoft.com/office/2019/extlst" xmlns:r="http://schemas.openxmlformats.org/officeDocument/2006/relationships" xmlns:m="http://schemas.openxmlformats.org/officeDocument/2006/math" xmlns:v="urn:schemas-microsoft-com:vml" xmlns:wp14="http://schemas.microsoft.com/office/word/2010/wordprocessingDrawing" xmlns:wp="http://schemas.openxmlformats.org/drawingml/2006/wordprocessingDrawing" xmlns:w10="urn:schemas-microsoft-com:office:word" xmlns:w="http://schemas.openxmlformats.org/wordprocessingml/2006/main" xmlns:w14="http://schemas.microsoft.com/office/word/2010/wordml" xmlns:w15="http://schemas.microsoft.com/office/word/2012/wordml" xmlns:w16cex="http://schemas.microsoft.com/office/word/2018/wordml/cex" xmlns:w16cid="http://schemas.microsoft.com/office/word/2016/wordml/cid" xmlns:w16="http://schemas.microsoft.com/office/word/2018/wordml" xmlns:w16du="http://schemas.microsoft.com/office/word/2023/wordml/word16du" xmlns:w16sdtdh="http://schemas.microsoft.com/office/word/2020/wordml/sdtdatahash" xmlns:w16sdtfl="http://schemas.microsoft.com/office/word/2024/wordml/sdtformatlock" xmlns:w16se="http://schemas.microsoft.com/office/word/2015/wordml/symex" xmlns:wpg="http://schemas.microsoft.com/office/word/2010/wordprocessingGroup" xmlns:wpi="http://schemas.microsoft.com/office/word/2010/wordprocessingInk" xmlns:wne="http://schemas.microsoft.com/office/word/2006/wordml" xmlns:wps="http://schemas.microsoft.com/office/word/2010/wordprocessingShape" mc:Ignorable="w14 w15 w16se w16cid w16 w16cex w16sdtdh w16sdtfl w16du wp14">
+<w:document xmlns:wpc="http://schemas.microsoft.com/office/word/2010/wordprocessingCanvas" xmlns:cx="http://schemas.microsoft.com/office/drawing/2014/chartex" xmlns:cx1="http://schemas.microsoft.com/office/drawing/2015/9/8/chartex" xmlns:cx2="http://schemas.microsoft.com/office/drawing/2015/10/21/chartex" xmlns:cx3="http://schemas.microsoft.com/office/drawing/2016/5/9/chartex" xmlns:cx4="http://schemas.microsoft.com/office/drawing/2016/5/10/chartex" xmlns:cx5="http://schemas.microsoft.com/office/drawing/2016/5/11/chartex" xmlns:cx6="http://schemas.microsoft.com/office/drawing/2016/5/12/chartex" xmlns:cx7="http://schemas.microsoft.com/office/drawing/2016/5/13/chartex" xmlns:cx8="http://schemas.microsoft.com/office/drawing/2016/5/14/chartex" xmlns:mc="http://schemas.openxmlformats.org/markup-compatibility/2006" xmlns:aink="http://schemas.microsoft.com/office/drawing/2016/ink" xmlns:am3d="http://schemas.microsoft.com/office/drawing/2017/model3d" xmlns:o="urn:schemas-microsoft-com:office:office" xmlns:oel="http://schemas.microsoft.com/office/2019/extlst" xmlns:r="http://schemas.openxmlformats.org/officeDocument/2006/relationships" xmlns:m="http://schemas.openxmlformats.org/officeDocument/2006/math" xmlns:v="urn:schemas-microsoft-com:vml" xmlns:wp14="http://schemas.microsoft.com/office/word/2010/wordprocessingDrawing" xmlns:wp="http://schemas.openxmlformats.org/drawingml/2006/wordprocessingDrawing" xmlns:w10="urn:schemas-microsoft-com:office:word" xmlns:w="http://schemas.openxmlformats.org/wordprocessingml/2006/main" xmlns:w14="http://schemas.microsoft.com/office/word/2010/wordml" xmlns:w15="http://schemas.microsoft.com/office/word/2012/wordml" xmlns:w16cei="http://schemas.microsoft.com/office/word/2026/wordml/cei" xmlns:w16cex="http://schemas.microsoft.com/office/word/2018/wordml/cex" xmlns:w16cid="http://schemas.microsoft.com/office/word/2016/wordml/cid" xmlns:w16="http://schemas.microsoft.com/office/word/2018/wordml" xmlns:w16du="http://schemas.microsoft.com/office/word/2023/wordml/word16du" xmlns:w16sdtdh="http://schemas.microsoft.com/office/word/2020/wordml/sdtdatahash" xmlns:w16sdtfl="http://schemas.microsoft.com/office/word/2024/wordml/sdtformatlock" xmlns:w16se="http://schemas.microsoft.com/office/word/2015/wordml/symex" xmlns:wpg="http://schemas.microsoft.com/office/word/2010/wordprocessingGroup" xmlns:wpi="http://schemas.microsoft.com/office/word/2010/wordprocessingInk" xmlns:wne="http://schemas.microsoft.com/office/word/2006/wordml" xmlns:wps="http://schemas.microsoft.com/office/word/2010/wordprocessingShape" mc:Ignorable="w14 w15 w16se w16cid w16 w16cex w16sdtdh w16sdtfl w16du wp14">
   <w:body>
     <w:p>
       <w:pPr>
@@ -10255,10 +10255,7 @@
         <w:framePr w:wrap="notBeside"/>
       </w:pPr>
       <w:r>
-        <w:t>//</w:t>
-      </w:r>
-      <w:r>
-        <w:t>Nobody creates</w:t>
+        <w:t>//Nobody creates</w:t>
       </w:r>
     </w:p>
     <w:p>
@@ -10276,10 +10273,7 @@
         <w:framePr w:wrap="notBeside"/>
       </w:pPr>
       <w:r>
-        <w:t>//</w:t>
-      </w:r>
-      <w:r>
-        <w:t>.NET injects everything.</w:t>
+        <w:t>//.NET injects everything.</w:t>
       </w:r>
     </w:p>
     <w:p/>
@@ -10397,6 +10391,1258 @@
     <w:p>
       <w:r>
         <w:t>public variables start with uppercase: Name, private ones with camelcase : _name.</w:t>
+      </w:r>
+    </w:p>
+    <w:p>
+      <w:pPr>
+        <w:pStyle w:val="Heading1"/>
+      </w:pPr>
+      <w:r>
+        <w:t>Some cool C# features:</w:t>
+      </w:r>
+    </w:p>
+    <w:p>
+      <w:pPr>
+        <w:pStyle w:val="Heading2"/>
+        <w:rPr>
+          <w:rFonts w:eastAsia="Times New Roman"/>
+          <w:lang w:bidi="ar-SA"/>
+        </w:rPr>
+      </w:pPr>
+      <w:r>
+        <w:rPr>
+          <w:rFonts w:eastAsia="Times New Roman"/>
+          <w:lang w:bidi="ar-SA"/>
+        </w:rPr>
+        <w:t>expression-bodied method</w:t>
+      </w:r>
+    </w:p>
+    <w:p>
+      <w:pPr>
+        <w:pStyle w:val="codesnippet"/>
+        <w:framePr w:wrap="notBeside"/>
+        <w:rPr>
+          <w:color w:val="EAECF0"/>
+          <w:lang w:bidi="ar-SA"/>
+        </w:rPr>
+      </w:pPr>
+      <w:r>
+        <w:rPr>
+          <w:color w:val="CC7BF4"/>
+          <w:lang w:bidi="ar-SA"/>
+        </w:rPr>
+        <w:t>private</w:t>
+      </w:r>
+      <w:r>
+        <w:rPr>
+          <w:color w:val="EAECF0"/>
+          <w:lang w:bidi="ar-SA"/>
+        </w:rPr>
+        <w:t xml:space="preserve"> </w:t>
+      </w:r>
+      <w:r>
+        <w:rPr>
+          <w:color w:val="CC7BF4"/>
+          <w:lang w:bidi="ar-SA"/>
+        </w:rPr>
+        <w:t>static</w:t>
+      </w:r>
+      <w:r>
+        <w:rPr>
+          <w:color w:val="EAECF0"/>
+          <w:lang w:bidi="ar-SA"/>
+        </w:rPr>
+        <w:t xml:space="preserve"> </w:t>
+      </w:r>
+      <w:r>
+        <w:rPr>
+          <w:lang w:bidi="ar-SA"/>
+        </w:rPr>
+        <w:t>List</w:t>
+      </w:r>
+      <w:r>
+        <w:rPr>
+          <w:color w:val="D3D7DE"/>
+          <w:lang w:bidi="ar-SA"/>
+        </w:rPr>
+        <w:t>&lt;</w:t>
+      </w:r>
+      <w:r>
+        <w:rPr>
+          <w:lang w:bidi="ar-SA"/>
+        </w:rPr>
+        <w:t>EmailHistoryDto</w:t>
+      </w:r>
+      <w:r>
+        <w:rPr>
+          <w:color w:val="D3D7DE"/>
+          <w:lang w:bidi="ar-SA"/>
+        </w:rPr>
+        <w:t>&gt;</w:t>
+      </w:r>
+      <w:r>
+        <w:rPr>
+          <w:color w:val="EAECF0"/>
+          <w:lang w:bidi="ar-SA"/>
+        </w:rPr>
+        <w:t xml:space="preserve"> </w:t>
+      </w:r>
+      <w:r>
+        <w:rPr>
+          <w:color w:val="70B8FF"/>
+          <w:lang w:bidi="ar-SA"/>
+        </w:rPr>
+        <w:t>ToDtos</w:t>
+      </w:r>
+      <w:r>
+        <w:rPr>
+          <w:color w:val="D3D7DE"/>
+          <w:lang w:bidi="ar-SA"/>
+        </w:rPr>
+        <w:t>(</w:t>
+      </w:r>
+      <w:r>
+        <w:rPr>
+          <w:lang w:bidi="ar-SA"/>
+        </w:rPr>
+        <w:t>IEnumerable</w:t>
+      </w:r>
+      <w:r>
+        <w:rPr>
+          <w:color w:val="D3D7DE"/>
+          <w:lang w:bidi="ar-SA"/>
+        </w:rPr>
+        <w:t>&lt;</w:t>
+      </w:r>
+      <w:r>
+        <w:rPr>
+          <w:lang w:bidi="ar-SA"/>
+        </w:rPr>
+        <w:t>EmailHistory</w:t>
+      </w:r>
+      <w:r>
+        <w:rPr>
+          <w:color w:val="D3D7DE"/>
+          <w:lang w:bidi="ar-SA"/>
+        </w:rPr>
+        <w:t>&gt;?</w:t>
+      </w:r>
+      <w:r>
+        <w:rPr>
+          <w:color w:val="EAECF0"/>
+          <w:lang w:bidi="ar-SA"/>
+        </w:rPr>
+        <w:t xml:space="preserve"> history</w:t>
+      </w:r>
+      <w:r>
+        <w:rPr>
+          <w:color w:val="D3D7DE"/>
+          <w:lang w:bidi="ar-SA"/>
+        </w:rPr>
+        <w:t>)</w:t>
+      </w:r>
+      <w:r>
+        <w:rPr>
+          <w:color w:val="EAECF0"/>
+          <w:lang w:bidi="ar-SA"/>
+        </w:rPr>
+        <w:t xml:space="preserve"> =&gt;</w:t>
+      </w:r>
+    </w:p>
+    <w:p>
+      <w:pPr>
+        <w:pStyle w:val="codesnippet"/>
+        <w:framePr w:wrap="notBeside"/>
+        <w:rPr>
+          <w:color w:val="EAECF0"/>
+          <w:lang w:bidi="ar-SA"/>
+        </w:rPr>
+      </w:pPr>
+      <w:r>
+        <w:rPr>
+          <w:color w:val="EAECF0"/>
+          <w:lang w:bidi="ar-SA"/>
+        </w:rPr>
+        <w:t xml:space="preserve">    ...</w:t>
+      </w:r>
+      <w:r>
+        <w:rPr>
+          <w:color w:val="D3D7DE"/>
+          <w:lang w:bidi="ar-SA"/>
+        </w:rPr>
+        <w:t>;</w:t>
+      </w:r>
+    </w:p>
+    <w:p>
+      <w:pPr>
+        <w:spacing w:before="100" w:beforeAutospacing="1" w:after="100" w:afterAutospacing="1" w:line="240" w:lineRule="auto"/>
+        <w:rPr>
+          <w:rFonts w:eastAsia="Times New Roman" w:cs="Times New Roman"/>
+          <w:kern w:val="0"/>
+          <w:lang w:bidi="ar-SA"/>
+          <w14:ligatures w14:val="none"/>
+        </w:rPr>
+      </w:pPr>
+      <w:r>
+        <w:rPr>
+          <w:rFonts w:eastAsia="Times New Roman" w:cs="Times New Roman"/>
+          <w:kern w:val="0"/>
+          <w:lang w:bidi="ar-SA"/>
+          <w14:ligatures w14:val="none"/>
+        </w:rPr>
+        <w:t xml:space="preserve">The </w:t>
+      </w:r>
+      <w:r>
+        <w:rPr>
+          <w:rFonts w:ascii="Courier New" w:eastAsia="Times New Roman" w:hAnsi="Courier New" w:cs="Courier New"/>
+          <w:kern w:val="0"/>
+          <w:sz w:val="20"/>
+          <w:szCs w:val="20"/>
+          <w:lang w:bidi="ar-SA"/>
+          <w14:ligatures w14:val="none"/>
+        </w:rPr>
+        <w:t>=&gt;</w:t>
+      </w:r>
+      <w:r>
+        <w:rPr>
+          <w:rFonts w:eastAsia="Times New Roman" w:cs="Times New Roman"/>
+          <w:kern w:val="0"/>
+          <w:lang w:bidi="ar-SA"/>
+          <w14:ligatures w14:val="none"/>
+        </w:rPr>
+        <w:t xml:space="preserve"> right after the parameter list (instead of </w:t>
+      </w:r>
+      <w:r>
+        <w:rPr>
+          <w:rFonts w:ascii="Courier New" w:eastAsia="Times New Roman" w:hAnsi="Courier New" w:cs="Courier New"/>
+          <w:kern w:val="0"/>
+          <w:sz w:val="20"/>
+          <w:szCs w:val="20"/>
+          <w:lang w:bidi="ar-SA"/>
+          <w14:ligatures w14:val="none"/>
+        </w:rPr>
+        <w:t>{ return ...; }</w:t>
+      </w:r>
+      <w:r>
+        <w:rPr>
+          <w:rFonts w:eastAsia="Times New Roman" w:cs="Times New Roman"/>
+          <w:kern w:val="0"/>
+          <w:lang w:bidi="ar-SA"/>
+          <w14:ligatures w14:val="none"/>
+        </w:rPr>
+        <w:t xml:space="preserve">) is an </w:t>
+      </w:r>
+      <w:r>
+        <w:rPr>
+          <w:rFonts w:eastAsia="Times New Roman" w:cs="Times New Roman"/>
+          <w:b/>
+          <w:bCs/>
+          <w:kern w:val="0"/>
+          <w:lang w:bidi="ar-SA"/>
+          <w14:ligatures w14:val="none"/>
+        </w:rPr>
+        <w:t>expression-bodied member</w:t>
+      </w:r>
+      <w:r>
+        <w:rPr>
+          <w:rFonts w:eastAsia="Times New Roman" w:cs="Times New Roman"/>
+          <w:kern w:val="0"/>
+          <w:lang w:bidi="ar-SA"/>
+          <w14:ligatures w14:val="none"/>
+        </w:rPr>
+        <w:t>. It's just shorthand for:</w:t>
+      </w:r>
+    </w:p>
+    <w:p>
+      <w:pPr>
+        <w:pStyle w:val="codesnippet"/>
+        <w:framePr w:wrap="notBeside"/>
+        <w:rPr>
+          <w:color w:val="EAECF0"/>
+          <w:lang w:bidi="ar-SA"/>
+        </w:rPr>
+      </w:pPr>
+      <w:r>
+        <w:rPr>
+          <w:color w:val="CC7BF4"/>
+          <w:lang w:bidi="ar-SA"/>
+        </w:rPr>
+        <w:t>private</w:t>
+      </w:r>
+      <w:r>
+        <w:rPr>
+          <w:color w:val="EAECF0"/>
+          <w:lang w:bidi="ar-SA"/>
+        </w:rPr>
+        <w:t xml:space="preserve"> </w:t>
+      </w:r>
+      <w:r>
+        <w:rPr>
+          <w:color w:val="CC7BF4"/>
+          <w:lang w:bidi="ar-SA"/>
+        </w:rPr>
+        <w:t>static</w:t>
+      </w:r>
+      <w:r>
+        <w:rPr>
+          <w:color w:val="EAECF0"/>
+          <w:lang w:bidi="ar-SA"/>
+        </w:rPr>
+        <w:t xml:space="preserve"> </w:t>
+      </w:r>
+      <w:r>
+        <w:rPr>
+          <w:lang w:bidi="ar-SA"/>
+        </w:rPr>
+        <w:t>List</w:t>
+      </w:r>
+      <w:r>
+        <w:rPr>
+          <w:color w:val="D3D7DE"/>
+          <w:lang w:bidi="ar-SA"/>
+        </w:rPr>
+        <w:t>&lt;</w:t>
+      </w:r>
+      <w:r>
+        <w:rPr>
+          <w:lang w:bidi="ar-SA"/>
+        </w:rPr>
+        <w:t>EmailHistoryDto</w:t>
+      </w:r>
+      <w:r>
+        <w:rPr>
+          <w:color w:val="D3D7DE"/>
+          <w:lang w:bidi="ar-SA"/>
+        </w:rPr>
+        <w:t>&gt;</w:t>
+      </w:r>
+      <w:r>
+        <w:rPr>
+          <w:color w:val="EAECF0"/>
+          <w:lang w:bidi="ar-SA"/>
+        </w:rPr>
+        <w:t xml:space="preserve"> </w:t>
+      </w:r>
+      <w:r>
+        <w:rPr>
+          <w:color w:val="70B8FF"/>
+          <w:lang w:bidi="ar-SA"/>
+        </w:rPr>
+        <w:t>ToDtos</w:t>
+      </w:r>
+      <w:r>
+        <w:rPr>
+          <w:color w:val="D3D7DE"/>
+          <w:lang w:bidi="ar-SA"/>
+        </w:rPr>
+        <w:t>(</w:t>
+      </w:r>
+      <w:r>
+        <w:rPr>
+          <w:lang w:bidi="ar-SA"/>
+        </w:rPr>
+        <w:t>IEnumerable</w:t>
+      </w:r>
+      <w:r>
+        <w:rPr>
+          <w:color w:val="D3D7DE"/>
+          <w:lang w:bidi="ar-SA"/>
+        </w:rPr>
+        <w:t>&lt;</w:t>
+      </w:r>
+      <w:r>
+        <w:rPr>
+          <w:lang w:bidi="ar-SA"/>
+        </w:rPr>
+        <w:t>EmailHistory</w:t>
+      </w:r>
+      <w:r>
+        <w:rPr>
+          <w:color w:val="D3D7DE"/>
+          <w:lang w:bidi="ar-SA"/>
+        </w:rPr>
+        <w:t>&gt;?</w:t>
+      </w:r>
+      <w:r>
+        <w:rPr>
+          <w:color w:val="EAECF0"/>
+          <w:lang w:bidi="ar-SA"/>
+        </w:rPr>
+        <w:t xml:space="preserve"> history</w:t>
+      </w:r>
+      <w:r>
+        <w:rPr>
+          <w:color w:val="D3D7DE"/>
+          <w:lang w:bidi="ar-SA"/>
+        </w:rPr>
+        <w:t>)</w:t>
+      </w:r>
+    </w:p>
+    <w:p>
+      <w:pPr>
+        <w:pStyle w:val="codesnippet"/>
+        <w:framePr w:wrap="notBeside"/>
+        <w:rPr>
+          <w:color w:val="EAECF0"/>
+          <w:lang w:bidi="ar-SA"/>
+        </w:rPr>
+      </w:pPr>
+      <w:r>
+        <w:rPr>
+          <w:color w:val="D3D7DE"/>
+          <w:lang w:bidi="ar-SA"/>
+        </w:rPr>
+        <w:t>{</w:t>
+      </w:r>
+    </w:p>
+    <w:p>
+      <w:pPr>
+        <w:pStyle w:val="codesnippet"/>
+        <w:framePr w:wrap="notBeside"/>
+        <w:rPr>
+          <w:color w:val="D3D7DE"/>
+        </w:rPr>
+      </w:pPr>
+      <w:r>
+        <w:rPr>
+          <w:color w:val="EAECF0"/>
+          <w:lang w:bidi="ar-SA"/>
+        </w:rPr>
+        <w:t xml:space="preserve">    </w:t>
+      </w:r>
+      <w:r>
+        <w:rPr>
+          <w:color w:val="CC7BF4"/>
+        </w:rPr>
+        <w:t>return</w:t>
+      </w:r>
+      <w:r>
+        <w:t xml:space="preserve"> history?</w:t>
+      </w:r>
+      <w:r>
+        <w:rPr>
+          <w:color w:val="D3D7DE"/>
+        </w:rPr>
+        <w:t>.</w:t>
+      </w:r>
+      <w:r>
+        <w:rPr>
+          <w:color w:val="70B8FF"/>
+        </w:rPr>
+        <w:t>Select</w:t>
+      </w:r>
+      <w:r>
+        <w:rPr>
+          <w:color w:val="D3D7DE"/>
+        </w:rPr>
+        <w:t>(</w:t>
+      </w:r>
+      <w:r>
+        <w:t>ToDto</w:t>
+      </w:r>
+      <w:r>
+        <w:rPr>
+          <w:color w:val="D3D7DE"/>
+        </w:rPr>
+        <w:t>).</w:t>
+      </w:r>
+      <w:r>
+        <w:rPr>
+          <w:color w:val="70B8FF"/>
+        </w:rPr>
+        <w:t>ToList</w:t>
+      </w:r>
+      <w:r>
+        <w:rPr>
+          <w:color w:val="D3D7DE"/>
+        </w:rPr>
+        <w:t>()</w:t>
+      </w:r>
+      <w:r>
+        <w:t xml:space="preserve"> ?? </w:t>
+      </w:r>
+      <w:r>
+        <w:rPr>
+          <w:color w:val="CC7BF4"/>
+        </w:rPr>
+        <w:t>new</w:t>
+      </w:r>
+      <w:r>
+        <w:t xml:space="preserve"> </w:t>
+      </w:r>
+      <w:r>
+        <w:rPr>
+          <w:color w:val="FBAD60"/>
+        </w:rPr>
+        <w:t>List</w:t>
+      </w:r>
+      <w:r>
+        <w:rPr>
+          <w:color w:val="D3D7DE"/>
+        </w:rPr>
+        <w:t>&lt;</w:t>
+      </w:r>
+      <w:r>
+        <w:rPr>
+          <w:color w:val="FBAD60"/>
+        </w:rPr>
+        <w:t>EmailHistoryDto</w:t>
+      </w:r>
+      <w:r>
+        <w:rPr>
+          <w:color w:val="D3D7DE"/>
+        </w:rPr>
+        <w:t>&gt;();</w:t>
+      </w:r>
+    </w:p>
+    <w:p>
+      <w:pPr>
+        <w:pStyle w:val="codesnippet"/>
+        <w:framePr w:wrap="notBeside"/>
+        <w:rPr>
+          <w:color w:val="EAECF0"/>
+          <w:lang w:bidi="ar-SA"/>
+        </w:rPr>
+      </w:pPr>
+      <w:r>
+        <w:rPr>
+          <w:color w:val="D3D7DE"/>
+          <w:lang w:bidi="ar-SA"/>
+        </w:rPr>
+        <w:t>}</w:t>
+      </w:r>
+    </w:p>
+    <w:p>
+      <w:pPr>
+        <w:spacing w:before="100" w:beforeAutospacing="1" w:after="100" w:afterAutospacing="1" w:line="240" w:lineRule="auto"/>
+        <w:rPr>
+          <w:rFonts w:eastAsia="Times New Roman" w:cs="Times New Roman"/>
+          <w:kern w:val="0"/>
+          <w:lang w:bidi="ar-SA"/>
+          <w14:ligatures w14:val="none"/>
+        </w:rPr>
+      </w:pPr>
+      <w:r>
+        <w:rPr>
+          <w:rFonts w:eastAsia="Times New Roman" w:cs="Times New Roman"/>
+          <w:kern w:val="0"/>
+          <w:lang w:bidi="ar-SA"/>
+          <w14:ligatures w14:val="none"/>
+        </w:rPr>
+        <w:t>Any method whose body is a single expression can be written this way. Purely a style choice — no different semantics.</w:t>
+      </w:r>
+    </w:p>
+    <w:p>
+      <w:pPr>
+        <w:pStyle w:val="Heading2"/>
+        <w:rPr>
+          <w:rFonts w:eastAsia="Times New Roman"/>
+          <w:lang w:bidi="ar-SA"/>
+        </w:rPr>
+      </w:pPr>
+      <w:r>
+        <w:rPr>
+          <w:rFonts w:eastAsia="Times New Roman"/>
+          <w:lang w:bidi="ar-SA"/>
+        </w:rPr>
+        <w:t xml:space="preserve">the null-conditional operator </w:t>
+      </w:r>
+      <w:r>
+        <w:rPr>
+          <w:rStyle w:val="codesnippetChar"/>
+        </w:rPr>
+        <w:t>?.</w:t>
+      </w:r>
+    </w:p>
+    <w:p>
+      <w:pPr>
+        <w:spacing w:before="100" w:beforeAutospacing="1" w:after="100" w:afterAutospacing="1" w:line="240" w:lineRule="auto"/>
+        <w:rPr>
+          <w:rFonts w:eastAsia="Times New Roman" w:cs="Times New Roman"/>
+          <w:b/>
+          <w:bCs/>
+          <w:color w:val="EE0000"/>
+          <w:kern w:val="0"/>
+          <w:lang w:bidi="ar-SA"/>
+          <w14:ligatures w14:val="none"/>
+        </w:rPr>
+      </w:pPr>
+      <w:r>
+        <w:rPr>
+          <w:rFonts w:eastAsia="Times New Roman" w:cs="Times New Roman"/>
+          <w:b/>
+          <w:bCs/>
+          <w:color w:val="EE0000"/>
+          <w:kern w:val="0"/>
+          <w:lang w:bidi="ar-SA"/>
+          <w14:ligatures w14:val="none"/>
+        </w:rPr>
+        <w:t xml:space="preserve">This is the "if not null, do the thing; if null, short-circuit" operator </w:t>
+      </w:r>
+    </w:p>
+    <w:p>
+      <w:pPr>
+        <w:spacing w:before="100" w:beforeAutospacing="1" w:after="100" w:afterAutospacing="1" w:line="240" w:lineRule="auto"/>
+        <w:rPr>
+          <w:rFonts w:eastAsia="Times New Roman" w:cs="Times New Roman"/>
+          <w:kern w:val="0"/>
+          <w:lang w:bidi="ar-SA"/>
+          <w14:ligatures w14:val="none"/>
+        </w:rPr>
+      </w:pPr>
+      <w:r>
+        <w:rPr>
+          <w:rFonts w:eastAsia="Times New Roman" w:cs="Times New Roman"/>
+          <w:kern w:val="0"/>
+          <w:lang w:bidi="ar-SA"/>
+          <w14:ligatures w14:val="none"/>
+        </w:rPr>
+        <w:t xml:space="preserve">If </w:t>
+      </w:r>
+      <w:r>
+        <w:rPr>
+          <w:rFonts w:ascii="Courier New" w:eastAsia="Times New Roman" w:hAnsi="Courier New" w:cs="Courier New"/>
+          <w:kern w:val="0"/>
+          <w:sz w:val="20"/>
+          <w:szCs w:val="20"/>
+          <w:lang w:bidi="ar-SA"/>
+          <w14:ligatures w14:val="none"/>
+        </w:rPr>
+        <w:t>history</w:t>
+      </w:r>
+      <w:r>
+        <w:rPr>
+          <w:rFonts w:eastAsia="Times New Roman" w:cs="Times New Roman"/>
+          <w:kern w:val="0"/>
+          <w:lang w:bidi="ar-SA"/>
+          <w14:ligatures w14:val="none"/>
+        </w:rPr>
+        <w:t xml:space="preserve"> is </w:t>
+      </w:r>
+      <w:r>
+        <w:rPr>
+          <w:rFonts w:ascii="Courier New" w:eastAsia="Times New Roman" w:hAnsi="Courier New" w:cs="Courier New"/>
+          <w:kern w:val="0"/>
+          <w:sz w:val="20"/>
+          <w:szCs w:val="20"/>
+          <w:lang w:bidi="ar-SA"/>
+          <w14:ligatures w14:val="none"/>
+        </w:rPr>
+        <w:t>null</w:t>
+      </w:r>
+      <w:r>
+        <w:rPr>
+          <w:rFonts w:eastAsia="Times New Roman" w:cs="Times New Roman"/>
+          <w:kern w:val="0"/>
+          <w:lang w:bidi="ar-SA"/>
+          <w14:ligatures w14:val="none"/>
+        </w:rPr>
+        <w:t xml:space="preserve"> → the whole expression </w:t>
+      </w:r>
+      <w:r>
+        <w:rPr>
+          <w:rFonts w:ascii="Courier New" w:eastAsia="Times New Roman" w:hAnsi="Courier New" w:cs="Courier New"/>
+          <w:kern w:val="0"/>
+          <w:sz w:val="20"/>
+          <w:szCs w:val="20"/>
+          <w:lang w:bidi="ar-SA"/>
+          <w14:ligatures w14:val="none"/>
+        </w:rPr>
+        <w:t>history?.Select(ToDto)</w:t>
+      </w:r>
+      <w:r>
+        <w:rPr>
+          <w:rFonts w:eastAsia="Times New Roman" w:cs="Times New Roman"/>
+          <w:kern w:val="0"/>
+          <w:lang w:bidi="ar-SA"/>
+          <w14:ligatures w14:val="none"/>
+        </w:rPr>
+        <w:t xml:space="preserve"> evaluates to </w:t>
+      </w:r>
+      <w:r>
+        <w:rPr>
+          <w:rFonts w:ascii="Courier New" w:eastAsia="Times New Roman" w:hAnsi="Courier New" w:cs="Courier New"/>
+          <w:kern w:val="0"/>
+          <w:sz w:val="20"/>
+          <w:szCs w:val="20"/>
+          <w:lang w:bidi="ar-SA"/>
+          <w14:ligatures w14:val="none"/>
+        </w:rPr>
+        <w:t>null</w:t>
+      </w:r>
+      <w:r>
+        <w:rPr>
+          <w:rFonts w:eastAsia="Times New Roman" w:cs="Times New Roman"/>
+          <w:kern w:val="0"/>
+          <w:lang w:bidi="ar-SA"/>
+          <w14:ligatures w14:val="none"/>
+        </w:rPr>
+        <w:t xml:space="preserve"> (specifically, </w:t>
+      </w:r>
+      <w:r>
+        <w:rPr>
+          <w:rFonts w:ascii="Courier New" w:eastAsia="Times New Roman" w:hAnsi="Courier New" w:cs="Courier New"/>
+          <w:kern w:val="0"/>
+          <w:sz w:val="20"/>
+          <w:szCs w:val="20"/>
+          <w:lang w:bidi="ar-SA"/>
+          <w14:ligatures w14:val="none"/>
+        </w:rPr>
+        <w:t>null</w:t>
+      </w:r>
+      <w:r>
+        <w:rPr>
+          <w:rFonts w:eastAsia="Times New Roman" w:cs="Times New Roman"/>
+          <w:kern w:val="0"/>
+          <w:lang w:bidi="ar-SA"/>
+          <w14:ligatures w14:val="none"/>
+        </w:rPr>
+        <w:t xml:space="preserve"> as </w:t>
+      </w:r>
+      <w:r>
+        <w:rPr>
+          <w:rFonts w:ascii="Courier New" w:eastAsia="Times New Roman" w:hAnsi="Courier New" w:cs="Courier New"/>
+          <w:kern w:val="0"/>
+          <w:sz w:val="20"/>
+          <w:szCs w:val="20"/>
+          <w:lang w:bidi="ar-SA"/>
+          <w14:ligatures w14:val="none"/>
+        </w:rPr>
+        <w:t>IEnumerable&lt;EmailHistoryDto&gt;?</w:t>
+      </w:r>
+      <w:r>
+        <w:rPr>
+          <w:rFonts w:eastAsia="Times New Roman" w:cs="Times New Roman"/>
+          <w:kern w:val="0"/>
+          <w:lang w:bidi="ar-SA"/>
+          <w14:ligatures w14:val="none"/>
+        </w:rPr>
+        <w:t xml:space="preserve">), and it never even calls </w:t>
+      </w:r>
+      <w:r>
+        <w:rPr>
+          <w:rFonts w:ascii="Courier New" w:eastAsia="Times New Roman" w:hAnsi="Courier New" w:cs="Courier New"/>
+          <w:kern w:val="0"/>
+          <w:sz w:val="20"/>
+          <w:szCs w:val="20"/>
+          <w:lang w:bidi="ar-SA"/>
+          <w14:ligatures w14:val="none"/>
+        </w:rPr>
+        <w:t>.Select</w:t>
+      </w:r>
+      <w:r>
+        <w:rPr>
+          <w:rFonts w:eastAsia="Times New Roman" w:cs="Times New Roman"/>
+          <w:kern w:val="0"/>
+          <w:lang w:bidi="ar-SA"/>
+          <w14:ligatures w14:val="none"/>
+        </w:rPr>
+        <w:t>.</w:t>
+      </w:r>
+    </w:p>
+    <w:p>
+      <w:pPr>
+        <w:numPr>
+          <w:ilvl w:val="0"/>
+          <w:numId w:val="4"/>
+        </w:numPr>
+        <w:spacing w:before="100" w:beforeAutospacing="1" w:after="100" w:afterAutospacing="1" w:line="240" w:lineRule="auto"/>
+        <w:rPr>
+          <w:rFonts w:eastAsia="Times New Roman" w:cs="Times New Roman"/>
+          <w:kern w:val="0"/>
+          <w:lang w:bidi="ar-SA"/>
+          <w14:ligatures w14:val="none"/>
+        </w:rPr>
+      </w:pPr>
+      <w:r>
+        <w:rPr>
+          <w:rFonts w:eastAsia="Times New Roman" w:cs="Times New Roman"/>
+          <w:kern w:val="0"/>
+          <w:lang w:bidi="ar-SA"/>
+          <w14:ligatures w14:val="none"/>
+        </w:rPr>
+        <w:t xml:space="preserve">If </w:t>
+      </w:r>
+      <w:r>
+        <w:rPr>
+          <w:rFonts w:ascii="Courier New" w:eastAsia="Times New Roman" w:hAnsi="Courier New" w:cs="Courier New"/>
+          <w:kern w:val="0"/>
+          <w:sz w:val="20"/>
+          <w:szCs w:val="20"/>
+          <w:lang w:bidi="ar-SA"/>
+          <w14:ligatures w14:val="none"/>
+        </w:rPr>
+        <w:t>history</w:t>
+      </w:r>
+      <w:r>
+        <w:rPr>
+          <w:rFonts w:eastAsia="Times New Roman" w:cs="Times New Roman"/>
+          <w:kern w:val="0"/>
+          <w:lang w:bidi="ar-SA"/>
+          <w14:ligatures w14:val="none"/>
+        </w:rPr>
+        <w:t xml:space="preserve"> is not </w:t>
+      </w:r>
+      <w:r>
+        <w:rPr>
+          <w:rFonts w:ascii="Courier New" w:eastAsia="Times New Roman" w:hAnsi="Courier New" w:cs="Courier New"/>
+          <w:kern w:val="0"/>
+          <w:sz w:val="20"/>
+          <w:szCs w:val="20"/>
+          <w:lang w:bidi="ar-SA"/>
+          <w14:ligatures w14:val="none"/>
+        </w:rPr>
+        <w:t>null</w:t>
+      </w:r>
+      <w:r>
+        <w:rPr>
+          <w:rFonts w:eastAsia="Times New Roman" w:cs="Times New Roman"/>
+          <w:kern w:val="0"/>
+          <w:lang w:bidi="ar-SA"/>
+          <w14:ligatures w14:val="none"/>
+        </w:rPr>
+        <w:t xml:space="preserve"> → it calls </w:t>
+      </w:r>
+      <w:r>
+        <w:rPr>
+          <w:rFonts w:ascii="Courier New" w:eastAsia="Times New Roman" w:hAnsi="Courier New" w:cs="Courier New"/>
+          <w:kern w:val="0"/>
+          <w:sz w:val="20"/>
+          <w:szCs w:val="20"/>
+          <w:lang w:bidi="ar-SA"/>
+          <w14:ligatures w14:val="none"/>
+        </w:rPr>
+        <w:t>.Select(ToDto)</w:t>
+      </w:r>
+      <w:r>
+        <w:rPr>
+          <w:rFonts w:eastAsia="Times New Roman" w:cs="Times New Roman"/>
+          <w:kern w:val="0"/>
+          <w:lang w:bidi="ar-SA"/>
+          <w14:ligatures w14:val="none"/>
+        </w:rPr>
+        <w:t xml:space="preserve"> normally.</w:t>
+      </w:r>
+    </w:p>
+    <w:p>
+      <w:pPr>
+        <w:spacing w:before="100" w:beforeAutospacing="1" w:after="100" w:afterAutospacing="1" w:line="240" w:lineRule="auto"/>
+        <w:rPr>
+          <w:rFonts w:eastAsia="Times New Roman" w:cs="Times New Roman"/>
+          <w:kern w:val="0"/>
+          <w:lang w:bidi="ar-SA"/>
+          <w14:ligatures w14:val="none"/>
+        </w:rPr>
+      </w:pPr>
+      <w:r>
+        <w:rPr>
+          <w:rFonts w:eastAsia="Times New Roman" w:cs="Times New Roman"/>
+          <w:kern w:val="0"/>
+          <w:lang w:bidi="ar-SA"/>
+          <w14:ligatures w14:val="none"/>
+        </w:rPr>
+        <w:t xml:space="preserve">It's contagious too — </w:t>
+      </w:r>
+      <w:r>
+        <w:rPr>
+          <w:rFonts w:ascii="Courier New" w:eastAsia="Times New Roman" w:hAnsi="Courier New" w:cs="Courier New"/>
+          <w:kern w:val="0"/>
+          <w:sz w:val="20"/>
+          <w:szCs w:val="20"/>
+          <w:lang w:bidi="ar-SA"/>
+          <w14:ligatures w14:val="none"/>
+        </w:rPr>
+        <w:t>.ToList()</w:t>
+      </w:r>
+      <w:r>
+        <w:rPr>
+          <w:rFonts w:eastAsia="Times New Roman" w:cs="Times New Roman"/>
+          <w:kern w:val="0"/>
+          <w:lang w:bidi="ar-SA"/>
+          <w14:ligatures w14:val="none"/>
+        </w:rPr>
+        <w:t xml:space="preserve"> right after it also only runs if the earlier part wasn't null. So </w:t>
+      </w:r>
+      <w:r>
+        <w:rPr>
+          <w:rFonts w:ascii="Courier New" w:eastAsia="Times New Roman" w:hAnsi="Courier New" w:cs="Courier New"/>
+          <w:kern w:val="0"/>
+          <w:sz w:val="20"/>
+          <w:szCs w:val="20"/>
+          <w:lang w:bidi="ar-SA"/>
+          <w14:ligatures w14:val="none"/>
+        </w:rPr>
+        <w:t>history?.Select(ToDto).ToList()</w:t>
+      </w:r>
+      <w:r>
+        <w:rPr>
+          <w:rFonts w:eastAsia="Times New Roman" w:cs="Times New Roman"/>
+          <w:kern w:val="0"/>
+          <w:lang w:bidi="ar-SA"/>
+          <w14:ligatures w14:val="none"/>
+        </w:rPr>
+        <w:t xml:space="preserve"> means: if </w:t>
+      </w:r>
+      <w:r>
+        <w:rPr>
+          <w:rFonts w:ascii="Courier New" w:eastAsia="Times New Roman" w:hAnsi="Courier New" w:cs="Courier New"/>
+          <w:kern w:val="0"/>
+          <w:sz w:val="20"/>
+          <w:szCs w:val="20"/>
+          <w:lang w:bidi="ar-SA"/>
+          <w14:ligatures w14:val="none"/>
+        </w:rPr>
+        <w:t>history</w:t>
+      </w:r>
+      <w:r>
+        <w:rPr>
+          <w:rFonts w:eastAsia="Times New Roman" w:cs="Times New Roman"/>
+          <w:kern w:val="0"/>
+          <w:lang w:bidi="ar-SA"/>
+          <w14:ligatures w14:val="none"/>
+        </w:rPr>
+        <w:t xml:space="preserve"> is null, skip </w:t>
+      </w:r>
+      <w:r>
+        <w:rPr>
+          <w:rFonts w:ascii="Courier New" w:eastAsia="Times New Roman" w:hAnsi="Courier New" w:cs="Courier New"/>
+          <w:kern w:val="0"/>
+          <w:sz w:val="20"/>
+          <w:szCs w:val="20"/>
+          <w:lang w:bidi="ar-SA"/>
+          <w14:ligatures w14:val="none"/>
+        </w:rPr>
+        <w:t>Select</w:t>
+      </w:r>
+      <w:r>
+        <w:rPr>
+          <w:rFonts w:eastAsia="Times New Roman" w:cs="Times New Roman"/>
+          <w:kern w:val="0"/>
+          <w:lang w:bidi="ar-SA"/>
+          <w14:ligatures w14:val="none"/>
+        </w:rPr>
+        <w:t xml:space="preserve"> </w:t>
+      </w:r>
+      <w:r>
+        <w:rPr>
+          <w:rFonts w:eastAsia="Times New Roman" w:cs="Times New Roman"/>
+          <w:i/>
+          <w:iCs/>
+          <w:kern w:val="0"/>
+          <w:lang w:bidi="ar-SA"/>
+          <w14:ligatures w14:val="none"/>
+        </w:rPr>
+        <w:t>and</w:t>
+      </w:r>
+      <w:r>
+        <w:rPr>
+          <w:rFonts w:eastAsia="Times New Roman" w:cs="Times New Roman"/>
+          <w:kern w:val="0"/>
+          <w:lang w:bidi="ar-SA"/>
+          <w14:ligatures w14:val="none"/>
+        </w:rPr>
+        <w:t xml:space="preserve"> </w:t>
+      </w:r>
+      <w:r>
+        <w:rPr>
+          <w:rFonts w:ascii="Courier New" w:eastAsia="Times New Roman" w:hAnsi="Courier New" w:cs="Courier New"/>
+          <w:kern w:val="0"/>
+          <w:sz w:val="20"/>
+          <w:szCs w:val="20"/>
+          <w:lang w:bidi="ar-SA"/>
+          <w14:ligatures w14:val="none"/>
+        </w:rPr>
+        <w:t>ToList</w:t>
+      </w:r>
+      <w:r>
+        <w:rPr>
+          <w:rFonts w:eastAsia="Times New Roman" w:cs="Times New Roman"/>
+          <w:kern w:val="0"/>
+          <w:lang w:bidi="ar-SA"/>
+          <w14:ligatures w14:val="none"/>
+        </w:rPr>
+        <w:t xml:space="preserve">, and the whole chain evaluates to </w:t>
+      </w:r>
+      <w:r>
+        <w:rPr>
+          <w:rFonts w:ascii="Courier New" w:eastAsia="Times New Roman" w:hAnsi="Courier New" w:cs="Courier New"/>
+          <w:kern w:val="0"/>
+          <w:sz w:val="20"/>
+          <w:szCs w:val="20"/>
+          <w:lang w:bidi="ar-SA"/>
+          <w14:ligatures w14:val="none"/>
+        </w:rPr>
+        <w:t>null</w:t>
+      </w:r>
+      <w:r>
+        <w:rPr>
+          <w:rFonts w:eastAsia="Times New Roman" w:cs="Times New Roman"/>
+          <w:kern w:val="0"/>
+          <w:lang w:bidi="ar-SA"/>
+          <w14:ligatures w14:val="none"/>
+        </w:rPr>
+        <w:t>.</w:t>
+      </w:r>
+    </w:p>
+    <w:p>
+      <w:pPr>
+        <w:spacing w:before="100" w:beforeAutospacing="1" w:after="100" w:afterAutospacing="1" w:line="240" w:lineRule="auto"/>
+        <w:rPr>
+          <w:rFonts w:eastAsia="Times New Roman" w:cs="Times New Roman"/>
+          <w:b/>
+          <w:bCs/>
+          <w:kern w:val="0"/>
+          <w:lang w:bidi="ar-SA"/>
+          <w14:ligatures w14:val="none"/>
+        </w:rPr>
+      </w:pPr>
+      <w:r>
+        <w:rPr>
+          <w:rFonts w:eastAsia="Times New Roman" w:cs="Times New Roman"/>
+          <w:b/>
+          <w:bCs/>
+          <w:kern w:val="0"/>
+          <w:lang w:bidi="ar-SA"/>
+          <w14:ligatures w14:val="none"/>
+        </w:rPr>
+        <w:t xml:space="preserve">(Side note: </w:t>
+      </w:r>
+      <w:r>
+        <w:rPr>
+          <w:rFonts w:ascii="Courier New" w:eastAsia="Times New Roman" w:hAnsi="Courier New" w:cs="Courier New"/>
+          <w:b/>
+          <w:bCs/>
+          <w:kern w:val="0"/>
+          <w:sz w:val="20"/>
+          <w:szCs w:val="20"/>
+          <w:lang w:bidi="ar-SA"/>
+          <w14:ligatures w14:val="none"/>
+        </w:rPr>
+        <w:t>Select(ToDto)</w:t>
+      </w:r>
+      <w:r>
+        <w:rPr>
+          <w:rFonts w:eastAsia="Times New Roman" w:cs="Times New Roman"/>
+          <w:b/>
+          <w:bCs/>
+          <w:kern w:val="0"/>
+          <w:lang w:bidi="ar-SA"/>
+          <w14:ligatures w14:val="none"/>
+        </w:rPr>
+        <w:t xml:space="preserve"> is passing the </w:t>
+      </w:r>
+      <w:r>
+        <w:rPr>
+          <w:rFonts w:ascii="Courier New" w:eastAsia="Times New Roman" w:hAnsi="Courier New" w:cs="Courier New"/>
+          <w:b/>
+          <w:bCs/>
+          <w:kern w:val="0"/>
+          <w:sz w:val="20"/>
+          <w:szCs w:val="20"/>
+          <w:lang w:bidi="ar-SA"/>
+          <w14:ligatures w14:val="none"/>
+        </w:rPr>
+        <w:t>ToDto</w:t>
+      </w:r>
+      <w:r>
+        <w:rPr>
+          <w:rFonts w:eastAsia="Times New Roman" w:cs="Times New Roman"/>
+          <w:b/>
+          <w:bCs/>
+          <w:kern w:val="0"/>
+          <w:lang w:bidi="ar-SA"/>
+          <w14:ligatures w14:val="none"/>
+        </w:rPr>
+        <w:t xml:space="preserve"> method itself as the projection function — that's a method group being used where a </w:t>
+      </w:r>
+      <w:r>
+        <w:rPr>
+          <w:rFonts w:ascii="Courier New" w:eastAsia="Times New Roman" w:hAnsi="Courier New" w:cs="Courier New"/>
+          <w:b/>
+          <w:bCs/>
+          <w:kern w:val="0"/>
+          <w:sz w:val="20"/>
+          <w:szCs w:val="20"/>
+          <w:lang w:bidi="ar-SA"/>
+          <w14:ligatures w14:val="none"/>
+        </w:rPr>
+        <w:t>Func&lt;EmailHistory, EmailHistoryDto&gt;</w:t>
+      </w:r>
+      <w:r>
+        <w:rPr>
+          <w:rFonts w:eastAsia="Times New Roman" w:cs="Times New Roman"/>
+          <w:b/>
+          <w:bCs/>
+          <w:kern w:val="0"/>
+          <w:lang w:bidi="ar-SA"/>
+          <w14:ligatures w14:val="none"/>
+        </w:rPr>
+        <w:t xml:space="preserve"> is expected. Equivalent to writing </w:t>
+      </w:r>
+      <w:r>
+        <w:rPr>
+          <w:rFonts w:ascii="Courier New" w:eastAsia="Times New Roman" w:hAnsi="Courier New" w:cs="Courier New"/>
+          <w:b/>
+          <w:bCs/>
+          <w:kern w:val="0"/>
+          <w:sz w:val="20"/>
+          <w:szCs w:val="20"/>
+          <w:lang w:bidi="ar-SA"/>
+          <w14:ligatures w14:val="none"/>
+        </w:rPr>
+        <w:t>.Select(h =&gt; ToDto(h))</w:t>
+      </w:r>
+      <w:r>
+        <w:rPr>
+          <w:rFonts w:eastAsia="Times New Roman" w:cs="Times New Roman"/>
+          <w:b/>
+          <w:bCs/>
+          <w:kern w:val="0"/>
+          <w:lang w:bidi="ar-SA"/>
+          <w14:ligatures w14:val="none"/>
+        </w:rPr>
+        <w:t>, just shorter.)</w:t>
+      </w:r>
+    </w:p>
+    <w:p>
+      <w:pPr>
+        <w:spacing w:before="100" w:beforeAutospacing="1" w:after="100" w:afterAutospacing="1" w:line="240" w:lineRule="auto"/>
+        <w:outlineLvl w:val="2"/>
+        <w:rPr>
+          <w:rStyle w:val="Heading2Char"/>
+          <w:lang w:bidi="ar-SA"/>
+        </w:rPr>
+      </w:pPr>
+      <w:r>
+        <w:rPr>
+          <w:rStyle w:val="Heading2Char"/>
+          <w:lang w:bidi="ar-SA"/>
+        </w:rPr>
+        <w:lastRenderedPageBreak/>
+        <w:t>the null-coalescing operator</w:t>
+      </w:r>
+      <w:r>
+        <w:rPr>
+          <w:rStyle w:val="Heading2Char"/>
+          <w:lang w:bidi="ar-SA"/>
+        </w:rPr>
+        <w:t xml:space="preserve"> </w:t>
+      </w:r>
+      <w:r>
+        <w:rPr>
+          <w:rStyle w:val="codesnippetChar"/>
+          <w:lang w:bidi="ar-SA"/>
+        </w:rPr>
+        <w:t>??</w:t>
+      </w:r>
+    </w:p>
+    <w:p>
+      <w:pPr>
+        <w:spacing w:before="100" w:beforeAutospacing="1" w:after="100" w:afterAutospacing="1" w:line="240" w:lineRule="auto"/>
+        <w:rPr>
+          <w:rFonts w:eastAsia="Times New Roman" w:cs="Times New Roman"/>
+          <w:b/>
+          <w:bCs/>
+          <w:color w:val="EE0000"/>
+          <w:kern w:val="0"/>
+          <w:lang w:bidi="ar-SA"/>
+          <w14:ligatures w14:val="none"/>
+        </w:rPr>
+      </w:pPr>
+      <w:r>
+        <w:rPr>
+          <w:rFonts w:eastAsia="Times New Roman" w:cs="Times New Roman"/>
+          <w:b/>
+          <w:bCs/>
+          <w:color w:val="EE0000"/>
+          <w:kern w:val="0"/>
+          <w:lang w:bidi="ar-SA"/>
+          <w14:ligatures w14:val="none"/>
+        </w:rPr>
+        <w:t>This is the one you described — but it's actually simpler than "if null, return null." It means: "if the left side is null, use the right side instead."</w:t>
+      </w:r>
+    </w:p>
+    <w:p>
+      <w:pPr>
+        <w:spacing w:after="0" w:line="240" w:lineRule="auto"/>
+        <w:rPr>
+          <w:rFonts w:eastAsia="Times New Roman" w:cs="Times New Roman"/>
+          <w:kern w:val="0"/>
+          <w:lang w:bidi="ar-SA"/>
+          <w14:ligatures w14:val="none"/>
+        </w:rPr>
+      </w:pPr>
+      <w:r>
+        <w:rPr>
+          <w:rFonts w:eastAsia="Times New Roman" w:cs="Times New Roman"/>
+          <w:kern w:val="0"/>
+          <w:lang w:bidi="ar-SA"/>
+          <w14:ligatures w14:val="none"/>
+        </w:rPr>
+        <w:t>csharp</w:t>
+      </w:r>
+    </w:p>
+    <w:p>
+      <w:pPr>
+        <w:pStyle w:val="codesnippet"/>
+        <w:framePr w:wrap="notBeside"/>
+        <w:rPr>
+          <w:lang w:bidi="ar-SA"/>
+        </w:rPr>
+      </w:pPr>
+      <w:r>
+        <w:rPr>
+          <w:lang w:bidi="ar-SA"/>
+        </w:rPr>
+        <w:t>leftExpression ?? rightExpression</w:t>
+      </w:r>
+    </w:p>
+    <w:p>
+      <w:pPr>
+        <w:numPr>
+          <w:ilvl w:val="0"/>
+          <w:numId w:val="5"/>
+        </w:numPr>
+        <w:spacing w:before="100" w:beforeAutospacing="1" w:after="100" w:afterAutospacing="1" w:line="240" w:lineRule="auto"/>
+        <w:rPr>
+          <w:rFonts w:eastAsia="Times New Roman" w:cs="Times New Roman"/>
+          <w:kern w:val="0"/>
+          <w:lang w:bidi="ar-SA"/>
+          <w14:ligatures w14:val="none"/>
+        </w:rPr>
+      </w:pPr>
+      <w:r>
+        <w:rPr>
+          <w:rFonts w:eastAsia="Times New Roman" w:cs="Times New Roman"/>
+          <w:kern w:val="0"/>
+          <w:lang w:bidi="ar-SA"/>
+          <w14:ligatures w14:val="none"/>
+        </w:rPr>
+        <w:t>Left side not null → result is the left side.</w:t>
+      </w:r>
+    </w:p>
+    <w:p>
+      <w:pPr>
+        <w:numPr>
+          <w:ilvl w:val="0"/>
+          <w:numId w:val="5"/>
+        </w:numPr>
+        <w:spacing w:before="100" w:beforeAutospacing="1" w:after="100" w:afterAutospacing="1" w:line="240" w:lineRule="auto"/>
+        <w:rPr>
+          <w:rFonts w:eastAsia="Times New Roman" w:cs="Times New Roman"/>
+          <w:kern w:val="0"/>
+          <w:lang w:bidi="ar-SA"/>
+          <w14:ligatures w14:val="none"/>
+        </w:rPr>
+      </w:pPr>
+      <w:r>
+        <w:rPr>
+          <w:rFonts w:eastAsia="Times New Roman" w:cs="Times New Roman"/>
+          <w:kern w:val="0"/>
+          <w:lang w:bidi="ar-SA"/>
+          <w14:ligatures w14:val="none"/>
+        </w:rPr>
+        <w:t>Left side null → result is the right side.</w:t>
       </w:r>
     </w:p>
     <w:p/>
@@ -10411,7 +11657,7 @@
 </file>
 
 <file path=word/numbering.xml><?xml version="1.0" encoding="utf-8"?>
-<w:numbering xmlns:wpc="http://schemas.microsoft.com/office/word/2010/wordprocessingCanvas" xmlns:cx="http://schemas.microsoft.com/office/drawing/2014/chartex" xmlns:cx1="http://schemas.microsoft.com/office/drawing/2015/9/8/chartex" xmlns:cx2="http://schemas.microsoft.com/office/drawing/2015/10/21/chartex" xmlns:cx3="http://schemas.microsoft.com/office/drawing/2016/5/9/chartex" xmlns:cx4="http://schemas.microsoft.com/office/drawing/2016/5/10/chartex" xmlns:cx5="http://schemas.microsoft.com/office/drawing/2016/5/11/chartex" xmlns:cx6="http://schemas.microsoft.com/office/drawing/2016/5/12/chartex" xmlns:cx7="http://schemas.microsoft.com/office/drawing/2016/5/13/chartex" xmlns:cx8="http://schemas.microsoft.com/office/drawing/2016/5/14/chartex" xmlns:mc="http://schemas.openxmlformats.org/markup-compatibility/2006" xmlns:aink="http://schemas.microsoft.com/office/drawing/2016/ink" xmlns:am3d="http://schemas.microsoft.com/office/drawing/2017/model3d" xmlns:o="urn:schemas-microsoft-com:office:office" xmlns:oel="http://schemas.microsoft.com/office/2019/extlst" xmlns:r="http://schemas.openxmlformats.org/officeDocument/2006/relationships" xmlns:m="http://schemas.openxmlformats.org/officeDocument/2006/math" xmlns:v="urn:schemas-microsoft-com:vml" xmlns:wp14="http://schemas.microsoft.com/office/word/2010/wordprocessingDrawing" xmlns:wp="http://schemas.openxmlformats.org/drawingml/2006/wordprocessingDrawing" xmlns:w10="urn:schemas-microsoft-com:office:word" xmlns:w="http://schemas.openxmlformats.org/wordprocessingml/2006/main" xmlns:w14="http://schemas.microsoft.com/office/word/2010/wordml" xmlns:w15="http://schemas.microsoft.com/office/word/2012/wordml" xmlns:w16cex="http://schemas.microsoft.com/office/word/2018/wordml/cex" xmlns:w16cid="http://schemas.microsoft.com/office/word/2016/wordml/cid" xmlns:w16="http://schemas.microsoft.com/office/word/2018/wordml" xmlns:w16du="http://schemas.microsoft.com/office/word/2023/wordml/word16du" xmlns:w16sdtdh="http://schemas.microsoft.com/office/word/2020/wordml/sdtdatahash" xmlns:w16sdtfl="http://schemas.microsoft.com/office/word/2024/wordml/sdtformatlock" xmlns:w16se="http://schemas.microsoft.com/office/word/2015/wordml/symex" xmlns:wpg="http://schemas.microsoft.com/office/word/2010/wordprocessingGroup" xmlns:wpi="http://schemas.microsoft.com/office/word/2010/wordprocessingInk" xmlns:wne="http://schemas.microsoft.com/office/word/2006/wordml" xmlns:wps="http://schemas.microsoft.com/office/word/2010/wordprocessingShape" mc:Ignorable="w14 w15 w16se w16cid w16 w16cex w16sdtdh w16sdtfl w16du wp14">
+<w:numbering xmlns:wpc="http://schemas.microsoft.com/office/word/2010/wordprocessingCanvas" xmlns:cx="http://schemas.microsoft.com/office/drawing/2014/chartex" xmlns:cx1="http://schemas.microsoft.com/office/drawing/2015/9/8/chartex" xmlns:cx2="http://schemas.microsoft.com/office/drawing/2015/10/21/chartex" xmlns:cx3="http://schemas.microsoft.com/office/drawing/2016/5/9/chartex" xmlns:cx4="http://schemas.microsoft.com/office/drawing/2016/5/10/chartex" xmlns:cx5="http://schemas.microsoft.com/office/drawing/2016/5/11/chartex" xmlns:cx6="http://schemas.microsoft.com/office/drawing/2016/5/12/chartex" xmlns:cx7="http://schemas.microsoft.com/office/drawing/2016/5/13/chartex" xmlns:cx8="http://schemas.microsoft.com/office/drawing/2016/5/14/chartex" xmlns:mc="http://schemas.openxmlformats.org/markup-compatibility/2006" xmlns:aink="http://schemas.microsoft.com/office/drawing/2016/ink" xmlns:am3d="http://schemas.microsoft.com/office/drawing/2017/model3d" xmlns:o="urn:schemas-microsoft-com:office:office" xmlns:oel="http://schemas.microsoft.com/office/2019/extlst" xmlns:r="http://schemas.openxmlformats.org/officeDocument/2006/relationships" xmlns:m="http://schemas.openxmlformats.org/officeDocument/2006/math" xmlns:v="urn:schemas-microsoft-com:vml" xmlns:wp14="http://schemas.microsoft.com/office/word/2010/wordprocessingDrawing" xmlns:wp="http://schemas.openxmlformats.org/drawingml/2006/wordprocessingDrawing" xmlns:w10="urn:schemas-microsoft-com:office:word" xmlns:w="http://schemas.openxmlformats.org/wordprocessingml/2006/main" xmlns:w14="http://schemas.microsoft.com/office/word/2010/wordml" xmlns:w15="http://schemas.microsoft.com/office/word/2012/wordml" xmlns:w16cei="http://schemas.microsoft.com/office/word/2026/wordml/cei" xmlns:w16cex="http://schemas.microsoft.com/office/word/2018/wordml/cex" xmlns:w16cid="http://schemas.microsoft.com/office/word/2016/wordml/cid" xmlns:w16="http://schemas.microsoft.com/office/word/2018/wordml" xmlns:w16du="http://schemas.microsoft.com/office/word/2023/wordml/word16du" xmlns:w16sdtdh="http://schemas.microsoft.com/office/word/2020/wordml/sdtdatahash" xmlns:w16sdtfl="http://schemas.microsoft.com/office/word/2024/wordml/sdtformatlock" xmlns:w16se="http://schemas.microsoft.com/office/word/2015/wordml/symex" xmlns:wpg="http://schemas.microsoft.com/office/word/2010/wordprocessingGroup" xmlns:wpi="http://schemas.microsoft.com/office/word/2010/wordprocessingInk" xmlns:wne="http://schemas.microsoft.com/office/word/2006/wordml" xmlns:wps="http://schemas.microsoft.com/office/word/2010/wordprocessingShape" mc:Ignorable="w14 w15 w16se w16cid w16 w16cex w16sdtdh w16sdtfl w16du wp14">
   <w:abstractNum w:abstractNumId="0" w15:restartNumberingAfterBreak="0">
     <w:nsid w:val="067441BC"/>
     <w:multiLevelType w:val="multilevel"/>
@@ -10563,6 +11809,304 @@
     </w:lvl>
   </w:abstractNum>
   <w:abstractNum w:abstractNumId="1" w15:restartNumberingAfterBreak="0">
+    <w:nsid w:val="100D77CB"/>
+    <w:multiLevelType w:val="multilevel"/>
+    <w:tmpl w:val="D7AEC38C"/>
+    <w:lvl w:ilvl="0">
+      <w:start w:val="1"/>
+      <w:numFmt w:val="bullet"/>
+      <w:lvlText w:val=""/>
+      <w:lvlJc w:val="left"/>
+      <w:pPr>
+        <w:tabs>
+          <w:tab w:val="num" w:pos="720"/>
+        </w:tabs>
+        <w:ind w:left="720" w:hanging="360"/>
+      </w:pPr>
+      <w:rPr>
+        <w:rFonts w:ascii="Symbol" w:hAnsi="Symbol" w:hint="default"/>
+        <w:sz w:val="20"/>
+      </w:rPr>
+    </w:lvl>
+    <w:lvl w:ilvl="1" w:tentative="1">
+      <w:start w:val="1"/>
+      <w:numFmt w:val="bullet"/>
+      <w:lvlText w:val="o"/>
+      <w:lvlJc w:val="left"/>
+      <w:pPr>
+        <w:tabs>
+          <w:tab w:val="num" w:pos="1440"/>
+        </w:tabs>
+        <w:ind w:left="1440" w:hanging="360"/>
+      </w:pPr>
+      <w:rPr>
+        <w:rFonts w:ascii="Courier New" w:hAnsi="Courier New" w:hint="default"/>
+        <w:sz w:val="20"/>
+      </w:rPr>
+    </w:lvl>
+    <w:lvl w:ilvl="2" w:tentative="1">
+      <w:start w:val="1"/>
+      <w:numFmt w:val="bullet"/>
+      <w:lvlText w:val=""/>
+      <w:lvlJc w:val="left"/>
+      <w:pPr>
+        <w:tabs>
+          <w:tab w:val="num" w:pos="2160"/>
+        </w:tabs>
+        <w:ind w:left="2160" w:hanging="360"/>
+      </w:pPr>
+      <w:rPr>
+        <w:rFonts w:ascii="Wingdings" w:hAnsi="Wingdings" w:hint="default"/>
+        <w:sz w:val="20"/>
+      </w:rPr>
+    </w:lvl>
+    <w:lvl w:ilvl="3" w:tentative="1">
+      <w:start w:val="1"/>
+      <w:numFmt w:val="bullet"/>
+      <w:lvlText w:val=""/>
+      <w:lvlJc w:val="left"/>
+      <w:pPr>
+        <w:tabs>
+          <w:tab w:val="num" w:pos="2880"/>
+        </w:tabs>
+        <w:ind w:left="2880" w:hanging="360"/>
+      </w:pPr>
+      <w:rPr>
+        <w:rFonts w:ascii="Wingdings" w:hAnsi="Wingdings" w:hint="default"/>
+        <w:sz w:val="20"/>
+      </w:rPr>
+    </w:lvl>
+    <w:lvl w:ilvl="4" w:tentative="1">
+      <w:start w:val="1"/>
+      <w:numFmt w:val="bullet"/>
+      <w:lvlText w:val=""/>
+      <w:lvlJc w:val="left"/>
+      <w:pPr>
+        <w:tabs>
+          <w:tab w:val="num" w:pos="3600"/>
+        </w:tabs>
+        <w:ind w:left="3600" w:hanging="360"/>
+      </w:pPr>
+      <w:rPr>
+        <w:rFonts w:ascii="Wingdings" w:hAnsi="Wingdings" w:hint="default"/>
+        <w:sz w:val="20"/>
+      </w:rPr>
+    </w:lvl>
+    <w:lvl w:ilvl="5" w:tentative="1">
+      <w:start w:val="1"/>
+      <w:numFmt w:val="bullet"/>
+      <w:lvlText w:val=""/>
+      <w:lvlJc w:val="left"/>
+      <w:pPr>
+        <w:tabs>
+          <w:tab w:val="num" w:pos="4320"/>
+        </w:tabs>
+        <w:ind w:left="4320" w:hanging="360"/>
+      </w:pPr>
+      <w:rPr>
+        <w:rFonts w:ascii="Wingdings" w:hAnsi="Wingdings" w:hint="default"/>
+        <w:sz w:val="20"/>
+      </w:rPr>
+    </w:lvl>
+    <w:lvl w:ilvl="6" w:tentative="1">
+      <w:start w:val="1"/>
+      <w:numFmt w:val="bullet"/>
+      <w:lvlText w:val=""/>
+      <w:lvlJc w:val="left"/>
+      <w:pPr>
+        <w:tabs>
+          <w:tab w:val="num" w:pos="5040"/>
+        </w:tabs>
+        <w:ind w:left="5040" w:hanging="360"/>
+      </w:pPr>
+      <w:rPr>
+        <w:rFonts w:ascii="Wingdings" w:hAnsi="Wingdings" w:hint="default"/>
+        <w:sz w:val="20"/>
+      </w:rPr>
+    </w:lvl>
+    <w:lvl w:ilvl="7" w:tentative="1">
+      <w:start w:val="1"/>
+      <w:numFmt w:val="bullet"/>
+      <w:lvlText w:val=""/>
+      <w:lvlJc w:val="left"/>
+      <w:pPr>
+        <w:tabs>
+          <w:tab w:val="num" w:pos="5760"/>
+        </w:tabs>
+        <w:ind w:left="5760" w:hanging="360"/>
+      </w:pPr>
+      <w:rPr>
+        <w:rFonts w:ascii="Wingdings" w:hAnsi="Wingdings" w:hint="default"/>
+        <w:sz w:val="20"/>
+      </w:rPr>
+    </w:lvl>
+    <w:lvl w:ilvl="8" w:tentative="1">
+      <w:start w:val="1"/>
+      <w:numFmt w:val="bullet"/>
+      <w:lvlText w:val=""/>
+      <w:lvlJc w:val="left"/>
+      <w:pPr>
+        <w:tabs>
+          <w:tab w:val="num" w:pos="6480"/>
+        </w:tabs>
+        <w:ind w:left="6480" w:hanging="360"/>
+      </w:pPr>
+      <w:rPr>
+        <w:rFonts w:ascii="Wingdings" w:hAnsi="Wingdings" w:hint="default"/>
+        <w:sz w:val="20"/>
+      </w:rPr>
+    </w:lvl>
+  </w:abstractNum>
+  <w:abstractNum w:abstractNumId="2" w15:restartNumberingAfterBreak="0">
+    <w:nsid w:val="4E0905C5"/>
+    <w:multiLevelType w:val="multilevel"/>
+    <w:tmpl w:val="0540DBB6"/>
+    <w:lvl w:ilvl="0">
+      <w:start w:val="1"/>
+      <w:numFmt w:val="bullet"/>
+      <w:lvlText w:val=""/>
+      <w:lvlJc w:val="left"/>
+      <w:pPr>
+        <w:tabs>
+          <w:tab w:val="num" w:pos="720"/>
+        </w:tabs>
+        <w:ind w:left="720" w:hanging="360"/>
+      </w:pPr>
+      <w:rPr>
+        <w:rFonts w:ascii="Symbol" w:hAnsi="Symbol" w:hint="default"/>
+        <w:sz w:val="20"/>
+      </w:rPr>
+    </w:lvl>
+    <w:lvl w:ilvl="1" w:tentative="1">
+      <w:start w:val="1"/>
+      <w:numFmt w:val="bullet"/>
+      <w:lvlText w:val="o"/>
+      <w:lvlJc w:val="left"/>
+      <w:pPr>
+        <w:tabs>
+          <w:tab w:val="num" w:pos="1440"/>
+        </w:tabs>
+        <w:ind w:left="1440" w:hanging="360"/>
+      </w:pPr>
+      <w:rPr>
+        <w:rFonts w:ascii="Courier New" w:hAnsi="Courier New" w:hint="default"/>
+        <w:sz w:val="20"/>
+      </w:rPr>
+    </w:lvl>
+    <w:lvl w:ilvl="2" w:tentative="1">
+      <w:start w:val="1"/>
+      <w:numFmt w:val="bullet"/>
+      <w:lvlText w:val=""/>
+      <w:lvlJc w:val="left"/>
+      <w:pPr>
+        <w:tabs>
+          <w:tab w:val="num" w:pos="2160"/>
+        </w:tabs>
+        <w:ind w:left="2160" w:hanging="360"/>
+      </w:pPr>
+      <w:rPr>
+        <w:rFonts w:ascii="Wingdings" w:hAnsi="Wingdings" w:hint="default"/>
+        <w:sz w:val="20"/>
+      </w:rPr>
+    </w:lvl>
+    <w:lvl w:ilvl="3" w:tentative="1">
+      <w:start w:val="1"/>
+      <w:numFmt w:val="bullet"/>
+      <w:lvlText w:val=""/>
+      <w:lvlJc w:val="left"/>
+      <w:pPr>
+        <w:tabs>
+          <w:tab w:val="num" w:pos="2880"/>
+        </w:tabs>
+        <w:ind w:left="2880" w:hanging="360"/>
+      </w:pPr>
+      <w:rPr>
+        <w:rFonts w:ascii="Wingdings" w:hAnsi="Wingdings" w:hint="default"/>
+        <w:sz w:val="20"/>
+      </w:rPr>
+    </w:lvl>
+    <w:lvl w:ilvl="4" w:tentative="1">
+      <w:start w:val="1"/>
+      <w:numFmt w:val="bullet"/>
+      <w:lvlText w:val=""/>
+      <w:lvlJc w:val="left"/>
+      <w:pPr>
+        <w:tabs>
+          <w:tab w:val="num" w:pos="3600"/>
+        </w:tabs>
+        <w:ind w:left="3600" w:hanging="360"/>
+      </w:pPr>
+      <w:rPr>
+        <w:rFonts w:ascii="Wingdings" w:hAnsi="Wingdings" w:hint="default"/>
+        <w:sz w:val="20"/>
+      </w:rPr>
+    </w:lvl>
+    <w:lvl w:ilvl="5" w:tentative="1">
+      <w:start w:val="1"/>
+      <w:numFmt w:val="bullet"/>
+      <w:lvlText w:val=""/>
+      <w:lvlJc w:val="left"/>
+      <w:pPr>
+        <w:tabs>
+          <w:tab w:val="num" w:pos="4320"/>
+        </w:tabs>
+        <w:ind w:left="4320" w:hanging="360"/>
+      </w:pPr>
+      <w:rPr>
+        <w:rFonts w:ascii="Wingdings" w:hAnsi="Wingdings" w:hint="default"/>
+        <w:sz w:val="20"/>
+      </w:rPr>
+    </w:lvl>
+    <w:lvl w:ilvl="6" w:tentative="1">
+      <w:start w:val="1"/>
+      <w:numFmt w:val="bullet"/>
+      <w:lvlText w:val=""/>
+      <w:lvlJc w:val="left"/>
+      <w:pPr>
+        <w:tabs>
+          <w:tab w:val="num" w:pos="5040"/>
+        </w:tabs>
+        <w:ind w:left="5040" w:hanging="360"/>
+      </w:pPr>
+      <w:rPr>
+        <w:rFonts w:ascii="Wingdings" w:hAnsi="Wingdings" w:hint="default"/>
+        <w:sz w:val="20"/>
+      </w:rPr>
+    </w:lvl>
+    <w:lvl w:ilvl="7" w:tentative="1">
+      <w:start w:val="1"/>
+      <w:numFmt w:val="bullet"/>
+      <w:lvlText w:val=""/>
+      <w:lvlJc w:val="left"/>
+      <w:pPr>
+        <w:tabs>
+          <w:tab w:val="num" w:pos="5760"/>
+        </w:tabs>
+        <w:ind w:left="5760" w:hanging="360"/>
+      </w:pPr>
+      <w:rPr>
+        <w:rFonts w:ascii="Wingdings" w:hAnsi="Wingdings" w:hint="default"/>
+        <w:sz w:val="20"/>
+      </w:rPr>
+    </w:lvl>
+    <w:lvl w:ilvl="8" w:tentative="1">
+      <w:start w:val="1"/>
+      <w:numFmt w:val="bullet"/>
+      <w:lvlText w:val=""/>
+      <w:lvlJc w:val="left"/>
+      <w:pPr>
+        <w:tabs>
+          <w:tab w:val="num" w:pos="6480"/>
+        </w:tabs>
+        <w:ind w:left="6480" w:hanging="360"/>
+      </w:pPr>
+      <w:rPr>
+        <w:rFonts w:ascii="Wingdings" w:hAnsi="Wingdings" w:hint="default"/>
+        <w:sz w:val="20"/>
+      </w:rPr>
+    </w:lvl>
+  </w:abstractNum>
+  <w:abstractNum w:abstractNumId="3" w15:restartNumberingAfterBreak="0">
     <w:nsid w:val="7BD0345A"/>
     <w:multiLevelType w:val="multilevel"/>
     <w:tmpl w:val="22B4D0DA"/>
@@ -10718,7 +12262,13 @@
     <w:abstractNumId w:val="0"/>
   </w:num>
   <w:num w:numId="3" w16cid:durableId="1933317131">
+    <w:abstractNumId w:val="3"/>
+  </w:num>
+  <w:num w:numId="4" w16cid:durableId="763842590">
     <w:abstractNumId w:val="1"/>
+  </w:num>
+  <w:num w:numId="5" w16cid:durableId="897788013">
+    <w:abstractNumId w:val="2"/>
   </w:num>
 </w:numbering>
 </file>

</xml_diff>